<commit_message>
docs: add pip install . step to Activity 1 setup guide
Updated ACTIVITY_01_MERGE_AND_DEPLOYMENT_CODE_GUIDE.docx to include
the missing 'pip install .' command as the first dependency installation step.

This installs the LoraForge package from pyproject.toml before installing
individual packages like vLLM, peft, transformers, etc. Using 'pip install .'
(not editable mode) which is compatible with the project's pyproject.toml.

Also updated section heading from 'Install vLLM...' to 'Install LoraForge package...'
to clarify the sequence of steps.

Co-Authored-By: Claude Sonnet 4.6 <noreply@anthropic.com>
</commit_message>
<xml_diff>
--- a/documentation/ACTIVITY_01_MERGE_AND_DEPLOYMENT_CODE_GUIDE.docx
+++ b/documentation/ACTIVITY_01_MERGE_AND_DEPLOYMENT_CODE_GUIDE.docx
@@ -2969,7 +2969,7 @@
           <w:sz w:val="22"/>
           <w:szCs w:val="22"/>
         </w:rPr>
-        <w:t xml:space="preserve">Install vLLM and supporting packages:</w:t>
+        <w:t xml:space="preserve">Install LoraForge package and dependencies:</w:t>
       </w:r>
     </w:p>
     <w:p>
@@ -2984,6 +2984,21 @@
           <w:sz w:val="20"/>
           <w:szCs w:val="20"/>
         </w:rPr>
+        <w:p>
+          <w:pPr>
+            <w:spacing w:before="40" w:after="40"/>
+            <w:ind w:left="360"/>
+          </w:pPr>
+          <w:r>
+            <w:rPr>
+              <w:rFonts w:ascii="Courier New" w:cs="Courier New" w:eastAsia="Courier New" w:hAnsi="Courier New"/>
+              <w:color w:val="1A1A1A"/>
+              <w:sz w:val="20"/>
+              <w:szCs w:val="20"/>
+            </w:rPr>
+            <w:t xml:space="preserve">pip install . --break-system-packages</w:t>
+          </w:r>
+        </w:p>
         <w:t xml:space="preserve">pip install vllm --break-system-packages</w:t>
       </w:r>
     </w:p>

</xml_diff>

<commit_message>
fix: regenerate Activity 1 guide — fixes corrupted docx, adds pip install . step
</commit_message>
<xml_diff>
--- a/documentation/ACTIVITY_01_MERGE_AND_DEPLOYMENT_CODE_GUIDE.docx
+++ b/documentation/ACTIVITY_01_MERGE_AND_DEPLOYMENT_CODE_GUIDE.docx
@@ -2969,7 +2969,7 @@
           <w:sz w:val="22"/>
           <w:szCs w:val="22"/>
         </w:rPr>
-        <w:t xml:space="preserve">Install LoraForge package and dependencies:</w:t>
+        <w:t xml:space="preserve">Install LoraForge package and all dependencies:</w:t>
       </w:r>
     </w:p>
     <w:p>
@@ -2984,21 +2984,21 @@
           <w:sz w:val="20"/>
           <w:szCs w:val="20"/>
         </w:rPr>
-        <w:p>
-          <w:pPr>
-            <w:spacing w:before="40" w:after="40"/>
-            <w:ind w:left="360"/>
-          </w:pPr>
-          <w:r>
-            <w:rPr>
-              <w:rFonts w:ascii="Courier New" w:cs="Courier New" w:eastAsia="Courier New" w:hAnsi="Courier New"/>
-              <w:color w:val="1A1A1A"/>
-              <w:sz w:val="20"/>
-              <w:szCs w:val="20"/>
-            </w:rPr>
-            <w:t xml:space="preserve">pip install . --break-system-packages</w:t>
-          </w:r>
-        </w:p>
+        <w:t xml:space="preserve">pip install . --break-system-packages</w:t>
+      </w:r>
+    </w:p>
+    <w:p>
+      <w:pPr>
+        <w:spacing w:before="40" w:after="40"/>
+        <w:ind w:left="360"/>
+      </w:pPr>
+      <w:r>
+        <w:rPr>
+          <w:rFonts w:ascii="Courier New" w:cs="Courier New" w:eastAsia="Courier New" w:hAnsi="Courier New"/>
+          <w:color w:val="1A1A1A"/>
+          <w:sz w:val="20"/>
+          <w:szCs w:val="20"/>
+        </w:rPr>
         <w:t xml:space="preserve">pip install vllm --break-system-packages</w:t>
       </w:r>
     </w:p>
@@ -8819,7 +8819,7 @@
                 <w:sz w:val="20"/>
                 <w:szCs w:val="20"/>
               </w:rPr>
-              <w:t xml:space="preserve">cd ~/LoraForge/code &amp;&amp; pip install vllm peft transformers accelerate datasets omegaconf openai --break-system-packages</w:t>
+              <w:t xml:space="preserve">cd ~/LoraForge/code &amp;&amp; pip install . --break-system-packages &amp;&amp; pip install vllm peft transformers accelerate datasets omegaconf openai --break-system-packages</w:t>
             </w:r>
           </w:p>
         </w:tc>

</xml_diff>